<commit_message>
Feat: inclusão de nova coluna no log detalhado informando qual foi o usuário que executou a rotina
</commit_message>
<xml_diff>
--- a/SmartCheck_Documentacao_Tecnica.docx
+++ b/SmartCheck_Documentacao_Tecnica.docx
@@ -2,11 +2,7 @@
 <file path=word/document.xml><?xml version="1.0" encoding="utf-8"?>
 <w:document xmlns:wpc="http://schemas.microsoft.com/office/word/2010/wordprocessingCanvas" xmlns:cx="http://schemas.microsoft.com/office/drawing/2014/chartex" xmlns:cx1="http://schemas.microsoft.com/office/drawing/2015/9/8/chartex" xmlns:cx2="http://schemas.microsoft.com/office/drawing/2015/10/21/chartex" xmlns:cx3="http://schemas.microsoft.com/office/drawing/2016/5/9/chartex" xmlns:cx4="http://schemas.microsoft.com/office/drawing/2016/5/10/chartex" xmlns:cx5="http://schemas.microsoft.com/office/drawing/2016/5/11/chartex" xmlns:cx6="http://schemas.microsoft.com/office/drawing/2016/5/12/chartex" xmlns:cx7="http://schemas.microsoft.com/office/drawing/2016/5/13/chartex" xmlns:cx8="http://schemas.microsoft.com/office/drawing/2016/5/14/chartex" xmlns:mc="http://schemas.openxmlformats.org/markup-compatibility/2006" xmlns:aink="http://schemas.microsoft.com/office/drawing/2016/ink" xmlns:am3d="http://schemas.microsoft.com/office/drawing/2017/model3d" xmlns:o="urn:schemas-microsoft-com:office:office" xmlns:oel="http://schemas.microsoft.com/office/2019/extlst" xmlns:r="http://schemas.openxmlformats.org/officeDocument/2006/relationships" xmlns:m="http://schemas.openxmlformats.org/officeDocument/2006/math" xmlns:v="urn:schemas-microsoft-com:vml" xmlns:wp14="http://schemas.microsoft.com/office/word/2010/wordprocessingDrawing" xmlns:wp="http://schemas.openxmlformats.org/drawingml/2006/wordprocessingDrawing" xmlns:w10="urn:schemas-microsoft-com:office:word" xmlns:w="http://schemas.openxmlformats.org/wordprocessingml/2006/main" xmlns:w14="http://schemas.microsoft.com/office/word/2010/wordml" xmlns:w15="http://schemas.microsoft.com/office/word/2012/wordml" xmlns:w16cex="http://schemas.microsoft.com/office/word/2018/wordml/cex" xmlns:w16cid="http://schemas.microsoft.com/office/word/2016/wordml/cid" xmlns:w16="http://schemas.microsoft.com/office/word/2018/wordml" xmlns:w16du="http://schemas.microsoft.com/office/word/2023/wordml/word16du" xmlns:w16sdtdh="http://schemas.microsoft.com/office/word/2020/wordml/sdtdatahash" xmlns:w16sdtfl="http://schemas.microsoft.com/office/word/2024/wordml/sdtformatlock" xmlns:w16se="http://schemas.microsoft.com/office/word/2015/wordml/symex" xmlns:wpg="http://schemas.microsoft.com/office/word/2010/wordprocessingGroup" xmlns:wpi="http://schemas.microsoft.com/office/word/2010/wordprocessingInk" xmlns:wne="http://schemas.microsoft.com/office/word/2006/wordml" xmlns:wps="http://schemas.microsoft.com/office/word/2010/wordprocessingShape" mc:Ignorable="w14 w15 w16se w16cid w16 w16cex w16sdtdh w16sdtfl w16du wp14">
   <w:body>
-    <w:p>
-      <w:pPr>
-        <w:spacing w:before="60" w:after="60"/>
-      </w:pPr>
-    </w:p>
+    <w:p/>
     <w:p>
       <w:pPr>
         <w:spacing w:before="60" w:after="60"/>
@@ -220,12 +216,6 @@
         <w:gridCol w:w="6047"/>
       </w:tblGrid>
       <w:tr>
-        <w:tblPrEx>
-          <w:tblCellMar>
-            <w:top w:w="0" w:type="dxa"/>
-            <w:bottom w:w="0" w:type="dxa"/>
-          </w:tblCellMar>
-        </w:tblPrEx>
         <w:tc>
           <w:tcPr>
             <w:tcW w:w="2800" w:type="dxa"/>
@@ -305,12 +295,6 @@
         </w:tc>
       </w:tr>
       <w:tr>
-        <w:tblPrEx>
-          <w:tblCellMar>
-            <w:top w:w="0" w:type="dxa"/>
-            <w:bottom w:w="0" w:type="dxa"/>
-          </w:tblCellMar>
-        </w:tblPrEx>
         <w:tc>
           <w:tcPr>
             <w:tcW w:w="2800" w:type="dxa"/>
@@ -382,12 +366,6 @@
         </w:tc>
       </w:tr>
       <w:tr>
-        <w:tblPrEx>
-          <w:tblCellMar>
-            <w:top w:w="0" w:type="dxa"/>
-            <w:bottom w:w="0" w:type="dxa"/>
-          </w:tblCellMar>
-        </w:tblPrEx>
         <w:tc>
           <w:tcPr>
             <w:tcW w:w="2800" w:type="dxa"/>
@@ -465,12 +443,6 @@
         </w:tc>
       </w:tr>
       <w:tr>
-        <w:tblPrEx>
-          <w:tblCellMar>
-            <w:top w:w="0" w:type="dxa"/>
-            <w:bottom w:w="0" w:type="dxa"/>
-          </w:tblCellMar>
-        </w:tblPrEx>
         <w:tc>
           <w:tcPr>
             <w:tcW w:w="2800" w:type="dxa"/>
@@ -524,12 +496,6 @@
         </w:tc>
       </w:tr>
       <w:tr>
-        <w:tblPrEx>
-          <w:tblCellMar>
-            <w:top w:w="0" w:type="dxa"/>
-            <w:bottom w:w="0" w:type="dxa"/>
-          </w:tblCellMar>
-        </w:tblPrEx>
         <w:tc>
           <w:tcPr>
             <w:tcW w:w="2800" w:type="dxa"/>
@@ -583,12 +549,6 @@
         </w:tc>
       </w:tr>
       <w:tr>
-        <w:tblPrEx>
-          <w:tblCellMar>
-            <w:top w:w="0" w:type="dxa"/>
-            <w:bottom w:w="0" w:type="dxa"/>
-          </w:tblCellMar>
-        </w:tblPrEx>
         <w:tc>
           <w:tcPr>
             <w:tcW w:w="2800" w:type="dxa"/>
@@ -642,12 +602,6 @@
         </w:tc>
       </w:tr>
       <w:tr>
-        <w:tblPrEx>
-          <w:tblCellMar>
-            <w:top w:w="0" w:type="dxa"/>
-            <w:bottom w:w="0" w:type="dxa"/>
-          </w:tblCellMar>
-        </w:tblPrEx>
         <w:tc>
           <w:tcPr>
             <w:tcW w:w="2800" w:type="dxa"/>
@@ -721,12 +675,6 @@
         </w:tc>
       </w:tr>
       <w:tr>
-        <w:tblPrEx>
-          <w:tblCellMar>
-            <w:top w:w="0" w:type="dxa"/>
-            <w:bottom w:w="0" w:type="dxa"/>
-          </w:tblCellMar>
-        </w:tblPrEx>
         <w:tc>
           <w:tcPr>
             <w:tcW w:w="2800" w:type="dxa"/>
@@ -780,12 +728,6 @@
         </w:tc>
       </w:tr>
       <w:tr>
-        <w:tblPrEx>
-          <w:tblCellMar>
-            <w:top w:w="0" w:type="dxa"/>
-            <w:bottom w:w="0" w:type="dxa"/>
-          </w:tblCellMar>
-        </w:tblPrEx>
         <w:tc>
           <w:tcPr>
             <w:tcW w:w="2800" w:type="dxa"/>
@@ -839,12 +781,6 @@
         </w:tc>
       </w:tr>
       <w:tr>
-        <w:tblPrEx>
-          <w:tblCellMar>
-            <w:top w:w="0" w:type="dxa"/>
-            <w:bottom w:w="0" w:type="dxa"/>
-          </w:tblCellMar>
-        </w:tblPrEx>
         <w:tc>
           <w:tcPr>
             <w:tcW w:w="2800" w:type="dxa"/>
@@ -952,12 +888,6 @@
         <w:gridCol w:w="6226"/>
       </w:tblGrid>
       <w:tr>
-        <w:tblPrEx>
-          <w:tblCellMar>
-            <w:top w:w="0" w:type="dxa"/>
-            <w:bottom w:w="0" w:type="dxa"/>
-          </w:tblCellMar>
-        </w:tblPrEx>
         <w:tc>
           <w:tcPr>
             <w:tcW w:w="2800" w:type="dxa"/>
@@ -1039,12 +969,6 @@
         </w:tc>
       </w:tr>
       <w:tr>
-        <w:tblPrEx>
-          <w:tblCellMar>
-            <w:top w:w="0" w:type="dxa"/>
-            <w:bottom w:w="0" w:type="dxa"/>
-          </w:tblCellMar>
-        </w:tblPrEx>
         <w:tc>
           <w:tcPr>
             <w:tcW w:w="2800" w:type="dxa"/>
@@ -1118,12 +1042,6 @@
         </w:tc>
       </w:tr>
       <w:tr>
-        <w:tblPrEx>
-          <w:tblCellMar>
-            <w:top w:w="0" w:type="dxa"/>
-            <w:bottom w:w="0" w:type="dxa"/>
-          </w:tblCellMar>
-        </w:tblPrEx>
         <w:tc>
           <w:tcPr>
             <w:tcW w:w="2800" w:type="dxa"/>
@@ -1205,12 +1123,6 @@
         </w:tc>
       </w:tr>
       <w:tr>
-        <w:tblPrEx>
-          <w:tblCellMar>
-            <w:top w:w="0" w:type="dxa"/>
-            <w:bottom w:w="0" w:type="dxa"/>
-          </w:tblCellMar>
-        </w:tblPrEx>
         <w:tc>
           <w:tcPr>
             <w:tcW w:w="2800" w:type="dxa"/>
@@ -1289,12 +1201,6 @@
         </w:tc>
       </w:tr>
       <w:tr>
-        <w:tblPrEx>
-          <w:tblCellMar>
-            <w:top w:w="0" w:type="dxa"/>
-            <w:bottom w:w="0" w:type="dxa"/>
-          </w:tblCellMar>
-        </w:tblPrEx>
         <w:tc>
           <w:tcPr>
             <w:tcW w:w="2800" w:type="dxa"/>
@@ -1368,12 +1274,6 @@
         </w:tc>
       </w:tr>
       <w:tr>
-        <w:tblPrEx>
-          <w:tblCellMar>
-            <w:top w:w="0" w:type="dxa"/>
-            <w:bottom w:w="0" w:type="dxa"/>
-          </w:tblCellMar>
-        </w:tblPrEx>
         <w:tc>
           <w:tcPr>
             <w:tcW w:w="2800" w:type="dxa"/>
@@ -1437,12 +1337,6 @@
         </w:tc>
       </w:tr>
       <w:tr>
-        <w:tblPrEx>
-          <w:tblCellMar>
-            <w:top w:w="0" w:type="dxa"/>
-            <w:bottom w:w="0" w:type="dxa"/>
-          </w:tblCellMar>
-        </w:tblPrEx>
         <w:tc>
           <w:tcPr>
             <w:tcW w:w="2800" w:type="dxa"/>
@@ -1515,12 +1409,6 @@
         </w:tc>
       </w:tr>
       <w:tr>
-        <w:tblPrEx>
-          <w:tblCellMar>
-            <w:top w:w="0" w:type="dxa"/>
-            <w:bottom w:w="0" w:type="dxa"/>
-          </w:tblCellMar>
-        </w:tblPrEx>
         <w:tc>
           <w:tcPr>
             <w:tcW w:w="2800" w:type="dxa"/>
@@ -1618,12 +1506,6 @@
         </w:tc>
       </w:tr>
       <w:tr>
-        <w:tblPrEx>
-          <w:tblCellMar>
-            <w:top w:w="0" w:type="dxa"/>
-            <w:bottom w:w="0" w:type="dxa"/>
-          </w:tblCellMar>
-        </w:tblPrEx>
         <w:tc>
           <w:tcPr>
             <w:tcW w:w="2800" w:type="dxa"/>
@@ -1748,12 +1630,6 @@
         <w:gridCol w:w="2526"/>
       </w:tblGrid>
       <w:tr>
-        <w:tblPrEx>
-          <w:tblCellMar>
-            <w:top w:w="0" w:type="dxa"/>
-            <w:bottom w:w="0" w:type="dxa"/>
-          </w:tblCellMar>
-        </w:tblPrEx>
         <w:trPr>
           <w:tblHeader/>
         </w:trPr>
@@ -1852,12 +1728,6 @@
         </w:tc>
       </w:tr>
       <w:tr>
-        <w:tblPrEx>
-          <w:tblCellMar>
-            <w:top w:w="0" w:type="dxa"/>
-            <w:bottom w:w="0" w:type="dxa"/>
-          </w:tblCellMar>
-        </w:tblPrEx>
         <w:tc>
           <w:tcPr>
             <w:tcW w:w="3000" w:type="dxa"/>
@@ -1925,12 +1795,6 @@
         </w:tc>
       </w:tr>
       <w:tr>
-        <w:tblPrEx>
-          <w:tblCellMar>
-            <w:top w:w="0" w:type="dxa"/>
-            <w:bottom w:w="0" w:type="dxa"/>
-          </w:tblCellMar>
-        </w:tblPrEx>
         <w:tc>
           <w:tcPr>
             <w:tcW w:w="3000" w:type="dxa"/>
@@ -1998,12 +1862,6 @@
         </w:tc>
       </w:tr>
       <w:tr>
-        <w:tblPrEx>
-          <w:tblCellMar>
-            <w:top w:w="0" w:type="dxa"/>
-            <w:bottom w:w="0" w:type="dxa"/>
-          </w:tblCellMar>
-        </w:tblPrEx>
         <w:tc>
           <w:tcPr>
             <w:tcW w:w="3000" w:type="dxa"/>
@@ -2075,12 +1933,6 @@
         </w:tc>
       </w:tr>
       <w:tr>
-        <w:tblPrEx>
-          <w:tblCellMar>
-            <w:top w:w="0" w:type="dxa"/>
-            <w:bottom w:w="0" w:type="dxa"/>
-          </w:tblCellMar>
-        </w:tblPrEx>
         <w:tc>
           <w:tcPr>
             <w:tcW w:w="3000" w:type="dxa"/>
@@ -2152,12 +2004,6 @@
         </w:tc>
       </w:tr>
       <w:tr>
-        <w:tblPrEx>
-          <w:tblCellMar>
-            <w:top w:w="0" w:type="dxa"/>
-            <w:bottom w:w="0" w:type="dxa"/>
-          </w:tblCellMar>
-        </w:tblPrEx>
         <w:tc>
           <w:tcPr>
             <w:tcW w:w="3000" w:type="dxa"/>
@@ -2229,12 +2075,6 @@
         </w:tc>
       </w:tr>
       <w:tr>
-        <w:tblPrEx>
-          <w:tblCellMar>
-            <w:top w:w="0" w:type="dxa"/>
-            <w:bottom w:w="0" w:type="dxa"/>
-          </w:tblCellMar>
-        </w:tblPrEx>
         <w:tc>
           <w:tcPr>
             <w:tcW w:w="3000" w:type="dxa"/>
@@ -2306,12 +2146,6 @@
         </w:tc>
       </w:tr>
       <w:tr>
-        <w:tblPrEx>
-          <w:tblCellMar>
-            <w:top w:w="0" w:type="dxa"/>
-            <w:bottom w:w="0" w:type="dxa"/>
-          </w:tblCellMar>
-        </w:tblPrEx>
         <w:tc>
           <w:tcPr>
             <w:tcW w:w="3000" w:type="dxa"/>
@@ -2383,12 +2217,6 @@
         </w:tc>
       </w:tr>
       <w:tr>
-        <w:tblPrEx>
-          <w:tblCellMar>
-            <w:top w:w="0" w:type="dxa"/>
-            <w:bottom w:w="0" w:type="dxa"/>
-          </w:tblCellMar>
-        </w:tblPrEx>
         <w:tc>
           <w:tcPr>
             <w:tcW w:w="3000" w:type="dxa"/>
@@ -2598,12 +2426,6 @@
         <w:gridCol w:w="6426"/>
       </w:tblGrid>
       <w:tr>
-        <w:tblPrEx>
-          <w:tblCellMar>
-            <w:top w:w="0" w:type="dxa"/>
-            <w:bottom w:w="0" w:type="dxa"/>
-          </w:tblCellMar>
-        </w:tblPrEx>
         <w:trPr>
           <w:tblHeader/>
         </w:trPr>
@@ -2671,12 +2493,6 @@
         </w:tc>
       </w:tr>
       <w:tr>
-        <w:tblPrEx>
-          <w:tblCellMar>
-            <w:top w:w="0" w:type="dxa"/>
-            <w:bottom w:w="0" w:type="dxa"/>
-          </w:tblCellMar>
-        </w:tblPrEx>
         <w:tc>
           <w:tcPr>
             <w:tcW w:w="2600" w:type="dxa"/>
@@ -2727,12 +2543,6 @@
         </w:tc>
       </w:tr>
       <w:tr>
-        <w:tblPrEx>
-          <w:tblCellMar>
-            <w:top w:w="0" w:type="dxa"/>
-            <w:bottom w:w="0" w:type="dxa"/>
-          </w:tblCellMar>
-        </w:tblPrEx>
         <w:tc>
           <w:tcPr>
             <w:tcW w:w="2600" w:type="dxa"/>
@@ -2783,12 +2593,6 @@
         </w:tc>
       </w:tr>
       <w:tr>
-        <w:tblPrEx>
-          <w:tblCellMar>
-            <w:top w:w="0" w:type="dxa"/>
-            <w:bottom w:w="0" w:type="dxa"/>
-          </w:tblCellMar>
-        </w:tblPrEx>
         <w:tc>
           <w:tcPr>
             <w:tcW w:w="2600" w:type="dxa"/>
@@ -2839,12 +2643,6 @@
         </w:tc>
       </w:tr>
       <w:tr>
-        <w:tblPrEx>
-          <w:tblCellMar>
-            <w:top w:w="0" w:type="dxa"/>
-            <w:bottom w:w="0" w:type="dxa"/>
-          </w:tblCellMar>
-        </w:tblPrEx>
         <w:tc>
           <w:tcPr>
             <w:tcW w:w="2600" w:type="dxa"/>
@@ -2895,12 +2693,6 @@
         </w:tc>
       </w:tr>
       <w:tr>
-        <w:tblPrEx>
-          <w:tblCellMar>
-            <w:top w:w="0" w:type="dxa"/>
-            <w:bottom w:w="0" w:type="dxa"/>
-          </w:tblCellMar>
-        </w:tblPrEx>
         <w:tc>
           <w:tcPr>
             <w:tcW w:w="2600" w:type="dxa"/>
@@ -2951,12 +2743,6 @@
         </w:tc>
       </w:tr>
       <w:tr>
-        <w:tblPrEx>
-          <w:tblCellMar>
-            <w:top w:w="0" w:type="dxa"/>
-            <w:bottom w:w="0" w:type="dxa"/>
-          </w:tblCellMar>
-        </w:tblPrEx>
         <w:tc>
           <w:tcPr>
             <w:tcW w:w="2600" w:type="dxa"/>
@@ -3038,12 +2824,6 @@
         <w:gridCol w:w="9026"/>
       </w:tblGrid>
       <w:tr>
-        <w:tblPrEx>
-          <w:tblCellMar>
-            <w:top w:w="0" w:type="dxa"/>
-            <w:bottom w:w="0" w:type="dxa"/>
-          </w:tblCellMar>
-        </w:tblPrEx>
         <w:tc>
           <w:tcPr>
             <w:tcW w:w="9026" w:type="dxa"/>
@@ -3191,12 +2971,6 @@
         <w:gridCol w:w="6226"/>
       </w:tblGrid>
       <w:tr>
-        <w:tblPrEx>
-          <w:tblCellMar>
-            <w:top w:w="0" w:type="dxa"/>
-            <w:bottom w:w="0" w:type="dxa"/>
-          </w:tblCellMar>
-        </w:tblPrEx>
         <w:trPr>
           <w:tblHeader/>
         </w:trPr>
@@ -3264,12 +3038,6 @@
         </w:tc>
       </w:tr>
       <w:tr>
-        <w:tblPrEx>
-          <w:tblCellMar>
-            <w:top w:w="0" w:type="dxa"/>
-            <w:bottom w:w="0" w:type="dxa"/>
-          </w:tblCellMar>
-        </w:tblPrEx>
         <w:tc>
           <w:tcPr>
             <w:tcW w:w="2800" w:type="dxa"/>
@@ -3318,12 +3086,6 @@
         </w:tc>
       </w:tr>
       <w:tr>
-        <w:tblPrEx>
-          <w:tblCellMar>
-            <w:top w:w="0" w:type="dxa"/>
-            <w:bottom w:w="0" w:type="dxa"/>
-          </w:tblCellMar>
-        </w:tblPrEx>
         <w:tc>
           <w:tcPr>
             <w:tcW w:w="2800" w:type="dxa"/>
@@ -3372,12 +3134,6 @@
         </w:tc>
       </w:tr>
       <w:tr>
-        <w:tblPrEx>
-          <w:tblCellMar>
-            <w:top w:w="0" w:type="dxa"/>
-            <w:bottom w:w="0" w:type="dxa"/>
-          </w:tblCellMar>
-        </w:tblPrEx>
         <w:tc>
           <w:tcPr>
             <w:tcW w:w="2800" w:type="dxa"/>
@@ -3431,12 +3187,6 @@
         </w:tc>
       </w:tr>
       <w:tr>
-        <w:tblPrEx>
-          <w:tblCellMar>
-            <w:top w:w="0" w:type="dxa"/>
-            <w:bottom w:w="0" w:type="dxa"/>
-          </w:tblCellMar>
-        </w:tblPrEx>
         <w:tc>
           <w:tcPr>
             <w:tcW w:w="2800" w:type="dxa"/>
@@ -3582,12 +3332,6 @@
         <w:gridCol w:w="6226"/>
       </w:tblGrid>
       <w:tr>
-        <w:tblPrEx>
-          <w:tblCellMar>
-            <w:top w:w="0" w:type="dxa"/>
-            <w:bottom w:w="0" w:type="dxa"/>
-          </w:tblCellMar>
-        </w:tblPrEx>
         <w:trPr>
           <w:tblHeader/>
         </w:trPr>
@@ -3655,12 +3399,6 @@
         </w:tc>
       </w:tr>
       <w:tr>
-        <w:tblPrEx>
-          <w:tblCellMar>
-            <w:top w:w="0" w:type="dxa"/>
-            <w:bottom w:w="0" w:type="dxa"/>
-          </w:tblCellMar>
-        </w:tblPrEx>
         <w:tc>
           <w:tcPr>
             <w:tcW w:w="2800" w:type="dxa"/>
@@ -3813,12 +3551,6 @@
         <w:gridCol w:w="4826"/>
       </w:tblGrid>
       <w:tr>
-        <w:tblPrEx>
-          <w:tblCellMar>
-            <w:top w:w="0" w:type="dxa"/>
-            <w:bottom w:w="0" w:type="dxa"/>
-          </w:tblCellMar>
-        </w:tblPrEx>
         <w:trPr>
           <w:tblHeader/>
         </w:trPr>
@@ -3917,12 +3649,6 @@
         </w:tc>
       </w:tr>
       <w:tr>
-        <w:tblPrEx>
-          <w:tblCellMar>
-            <w:top w:w="0" w:type="dxa"/>
-            <w:bottom w:w="0" w:type="dxa"/>
-          </w:tblCellMar>
-        </w:tblPrEx>
         <w:tc>
           <w:tcPr>
             <w:tcW w:w="2800" w:type="dxa"/>
@@ -3994,12 +3720,6 @@
         </w:tc>
       </w:tr>
       <w:tr>
-        <w:tblPrEx>
-          <w:tblCellMar>
-            <w:top w:w="0" w:type="dxa"/>
-            <w:bottom w:w="0" w:type="dxa"/>
-          </w:tblCellMar>
-        </w:tblPrEx>
         <w:tc>
           <w:tcPr>
             <w:tcW w:w="2800" w:type="dxa"/>
@@ -4071,12 +3791,6 @@
         </w:tc>
       </w:tr>
       <w:tr>
-        <w:tblPrEx>
-          <w:tblCellMar>
-            <w:top w:w="0" w:type="dxa"/>
-            <w:bottom w:w="0" w:type="dxa"/>
-          </w:tblCellMar>
-        </w:tblPrEx>
         <w:tc>
           <w:tcPr>
             <w:tcW w:w="2800" w:type="dxa"/>
@@ -4148,12 +3862,6 @@
         </w:tc>
       </w:tr>
       <w:tr>
-        <w:tblPrEx>
-          <w:tblCellMar>
-            <w:top w:w="0" w:type="dxa"/>
-            <w:bottom w:w="0" w:type="dxa"/>
-          </w:tblCellMar>
-        </w:tblPrEx>
         <w:tc>
           <w:tcPr>
             <w:tcW w:w="2800" w:type="dxa"/>
@@ -4235,12 +3943,6 @@
         </w:tc>
       </w:tr>
       <w:tr>
-        <w:tblPrEx>
-          <w:tblCellMar>
-            <w:top w:w="0" w:type="dxa"/>
-            <w:bottom w:w="0" w:type="dxa"/>
-          </w:tblCellMar>
-        </w:tblPrEx>
         <w:tc>
           <w:tcPr>
             <w:tcW w:w="2800" w:type="dxa"/>
@@ -4317,12 +4019,6 @@
         </w:tc>
       </w:tr>
       <w:tr>
-        <w:tblPrEx>
-          <w:tblCellMar>
-            <w:top w:w="0" w:type="dxa"/>
-            <w:bottom w:w="0" w:type="dxa"/>
-          </w:tblCellMar>
-        </w:tblPrEx>
         <w:tc>
           <w:tcPr>
             <w:tcW w:w="2800" w:type="dxa"/>
@@ -4420,12 +4116,6 @@
         <w:gridCol w:w="9026"/>
       </w:tblGrid>
       <w:tr>
-        <w:tblPrEx>
-          <w:tblCellMar>
-            <w:top w:w="0" w:type="dxa"/>
-            <w:bottom w:w="0" w:type="dxa"/>
-          </w:tblCellMar>
-        </w:tblPrEx>
         <w:tc>
           <w:tcPr>
             <w:tcW w:w="9026" w:type="dxa"/>
@@ -4541,12 +4231,6 @@
         <w:gridCol w:w="6226"/>
       </w:tblGrid>
       <w:tr>
-        <w:tblPrEx>
-          <w:tblCellMar>
-            <w:top w:w="0" w:type="dxa"/>
-            <w:bottom w:w="0" w:type="dxa"/>
-          </w:tblCellMar>
-        </w:tblPrEx>
         <w:tc>
           <w:tcPr>
             <w:tcW w:w="2800" w:type="dxa"/>
@@ -4600,12 +4284,6 @@
         </w:tc>
       </w:tr>
       <w:tr>
-        <w:tblPrEx>
-          <w:tblCellMar>
-            <w:top w:w="0" w:type="dxa"/>
-            <w:bottom w:w="0" w:type="dxa"/>
-          </w:tblCellMar>
-        </w:tblPrEx>
         <w:tc>
           <w:tcPr>
             <w:tcW w:w="2800" w:type="dxa"/>
@@ -4678,12 +4356,6 @@
         </w:tc>
       </w:tr>
       <w:tr>
-        <w:tblPrEx>
-          <w:tblCellMar>
-            <w:top w:w="0" w:type="dxa"/>
-            <w:bottom w:w="0" w:type="dxa"/>
-          </w:tblCellMar>
-        </w:tblPrEx>
         <w:tc>
           <w:tcPr>
             <w:tcW w:w="2800" w:type="dxa"/>
@@ -4737,12 +4409,6 @@
         </w:tc>
       </w:tr>
       <w:tr>
-        <w:tblPrEx>
-          <w:tblCellMar>
-            <w:top w:w="0" w:type="dxa"/>
-            <w:bottom w:w="0" w:type="dxa"/>
-          </w:tblCellMar>
-        </w:tblPrEx>
         <w:tc>
           <w:tcPr>
             <w:tcW w:w="2800" w:type="dxa"/>
@@ -4796,12 +4462,6 @@
         </w:tc>
       </w:tr>
       <w:tr>
-        <w:tblPrEx>
-          <w:tblCellMar>
-            <w:top w:w="0" w:type="dxa"/>
-            <w:bottom w:w="0" w:type="dxa"/>
-          </w:tblCellMar>
-        </w:tblPrEx>
         <w:tc>
           <w:tcPr>
             <w:tcW w:w="2800" w:type="dxa"/>
@@ -4926,12 +4586,6 @@
         <w:gridCol w:w="6026"/>
       </w:tblGrid>
       <w:tr>
-        <w:tblPrEx>
-          <w:tblCellMar>
-            <w:top w:w="0" w:type="dxa"/>
-            <w:bottom w:w="0" w:type="dxa"/>
-          </w:tblCellMar>
-        </w:tblPrEx>
         <w:trPr>
           <w:tblHeader/>
         </w:trPr>
@@ -4999,12 +4653,6 @@
         </w:tc>
       </w:tr>
       <w:tr>
-        <w:tblPrEx>
-          <w:tblCellMar>
-            <w:top w:w="0" w:type="dxa"/>
-            <w:bottom w:w="0" w:type="dxa"/>
-          </w:tblCellMar>
-        </w:tblPrEx>
         <w:tc>
           <w:tcPr>
             <w:tcW w:w="3000" w:type="dxa"/>
@@ -5055,12 +4703,6 @@
         </w:tc>
       </w:tr>
       <w:tr>
-        <w:tblPrEx>
-          <w:tblCellMar>
-            <w:top w:w="0" w:type="dxa"/>
-            <w:bottom w:w="0" w:type="dxa"/>
-          </w:tblCellMar>
-        </w:tblPrEx>
         <w:tc>
           <w:tcPr>
             <w:tcW w:w="3000" w:type="dxa"/>
@@ -5111,12 +4753,6 @@
         </w:tc>
       </w:tr>
       <w:tr>
-        <w:tblPrEx>
-          <w:tblCellMar>
-            <w:top w:w="0" w:type="dxa"/>
-            <w:bottom w:w="0" w:type="dxa"/>
-          </w:tblCellMar>
-        </w:tblPrEx>
         <w:tc>
           <w:tcPr>
             <w:tcW w:w="3000" w:type="dxa"/>
@@ -5167,12 +4803,6 @@
         </w:tc>
       </w:tr>
       <w:tr>
-        <w:tblPrEx>
-          <w:tblCellMar>
-            <w:top w:w="0" w:type="dxa"/>
-            <w:bottom w:w="0" w:type="dxa"/>
-          </w:tblCellMar>
-        </w:tblPrEx>
         <w:tc>
           <w:tcPr>
             <w:tcW w:w="3000" w:type="dxa"/>
@@ -5223,12 +4853,6 @@
         </w:tc>
       </w:tr>
       <w:tr>
-        <w:tblPrEx>
-          <w:tblCellMar>
-            <w:top w:w="0" w:type="dxa"/>
-            <w:bottom w:w="0" w:type="dxa"/>
-          </w:tblCellMar>
-        </w:tblPrEx>
         <w:tc>
           <w:tcPr>
             <w:tcW w:w="3000" w:type="dxa"/>
@@ -5279,12 +4903,6 @@
         </w:tc>
       </w:tr>
       <w:tr>
-        <w:tblPrEx>
-          <w:tblCellMar>
-            <w:top w:w="0" w:type="dxa"/>
-            <w:bottom w:w="0" w:type="dxa"/>
-          </w:tblCellMar>
-        </w:tblPrEx>
         <w:tc>
           <w:tcPr>
             <w:tcW w:w="3000" w:type="dxa"/>
@@ -5335,12 +4953,6 @@
         </w:tc>
       </w:tr>
       <w:tr>
-        <w:tblPrEx>
-          <w:tblCellMar>
-            <w:top w:w="0" w:type="dxa"/>
-            <w:bottom w:w="0" w:type="dxa"/>
-          </w:tblCellMar>
-        </w:tblPrEx>
         <w:tc>
           <w:tcPr>
             <w:tcW w:w="3000" w:type="dxa"/>
@@ -5391,12 +5003,6 @@
         </w:tc>
       </w:tr>
       <w:tr>
-        <w:tblPrEx>
-          <w:tblCellMar>
-            <w:top w:w="0" w:type="dxa"/>
-            <w:bottom w:w="0" w:type="dxa"/>
-          </w:tblCellMar>
-        </w:tblPrEx>
         <w:tc>
           <w:tcPr>
             <w:tcW w:w="3000" w:type="dxa"/>
@@ -5473,12 +5079,6 @@
         <w:gridCol w:w="9026"/>
       </w:tblGrid>
       <w:tr>
-        <w:tblPrEx>
-          <w:tblCellMar>
-            <w:top w:w="0" w:type="dxa"/>
-            <w:bottom w:w="0" w:type="dxa"/>
-          </w:tblCellMar>
-        </w:tblPrEx>
         <w:tc>
           <w:tcPr>
             <w:tcW w:w="9026" w:type="dxa"/>
@@ -5559,12 +5159,6 @@
         <w:gridCol w:w="9026"/>
       </w:tblGrid>
       <w:tr>
-        <w:tblPrEx>
-          <w:tblCellMar>
-            <w:top w:w="0" w:type="dxa"/>
-            <w:bottom w:w="0" w:type="dxa"/>
-          </w:tblCellMar>
-        </w:tblPrEx>
         <w:tc>
           <w:tcPr>
             <w:tcW w:w="9026" w:type="dxa"/>
@@ -5923,12 +5517,6 @@
         <w:gridCol w:w="5154"/>
       </w:tblGrid>
       <w:tr>
-        <w:tblPrEx>
-          <w:tblCellMar>
-            <w:top w:w="0" w:type="dxa"/>
-            <w:bottom w:w="0" w:type="dxa"/>
-          </w:tblCellMar>
-        </w:tblPrEx>
         <w:trPr>
           <w:tblHeader/>
         </w:trPr>
@@ -6027,12 +5615,6 @@
         </w:tc>
       </w:tr>
       <w:tr>
-        <w:tblPrEx>
-          <w:tblCellMar>
-            <w:top w:w="0" w:type="dxa"/>
-            <w:bottom w:w="0" w:type="dxa"/>
-          </w:tblCellMar>
-        </w:tblPrEx>
         <w:tc>
           <w:tcPr>
             <w:tcW w:w="800" w:type="dxa"/>
@@ -6110,12 +5692,6 @@
         </w:tc>
       </w:tr>
       <w:tr>
-        <w:tblPrEx>
-          <w:tblCellMar>
-            <w:top w:w="0" w:type="dxa"/>
-            <w:bottom w:w="0" w:type="dxa"/>
-          </w:tblCellMar>
-        </w:tblPrEx>
         <w:tc>
           <w:tcPr>
             <w:tcW w:w="800" w:type="dxa"/>
@@ -6192,12 +5768,6 @@
         </w:tc>
       </w:tr>
       <w:tr>
-        <w:tblPrEx>
-          <w:tblCellMar>
-            <w:top w:w="0" w:type="dxa"/>
-            <w:bottom w:w="0" w:type="dxa"/>
-          </w:tblCellMar>
-        </w:tblPrEx>
         <w:tc>
           <w:tcPr>
             <w:tcW w:w="800" w:type="dxa"/>
@@ -6274,12 +5844,6 @@
         </w:tc>
       </w:tr>
       <w:tr>
-        <w:tblPrEx>
-          <w:tblCellMar>
-            <w:top w:w="0" w:type="dxa"/>
-            <w:bottom w:w="0" w:type="dxa"/>
-          </w:tblCellMar>
-        </w:tblPrEx>
         <w:tc>
           <w:tcPr>
             <w:tcW w:w="800" w:type="dxa"/>
@@ -6359,12 +5923,6 @@
         </w:tc>
       </w:tr>
       <w:tr>
-        <w:tblPrEx>
-          <w:tblCellMar>
-            <w:top w:w="0" w:type="dxa"/>
-            <w:bottom w:w="0" w:type="dxa"/>
-          </w:tblCellMar>
-        </w:tblPrEx>
         <w:tc>
           <w:tcPr>
             <w:tcW w:w="800" w:type="dxa"/>
@@ -6692,12 +6250,6 @@
         <w:gridCol w:w="6226"/>
       </w:tblGrid>
       <w:tr>
-        <w:tblPrEx>
-          <w:tblCellMar>
-            <w:top w:w="0" w:type="dxa"/>
-            <w:bottom w:w="0" w:type="dxa"/>
-          </w:tblCellMar>
-        </w:tblPrEx>
         <w:trPr>
           <w:tblHeader/>
         </w:trPr>
@@ -6766,12 +6318,6 @@
         </w:tc>
       </w:tr>
       <w:tr>
-        <w:tblPrEx>
-          <w:tblCellMar>
-            <w:top w:w="0" w:type="dxa"/>
-            <w:bottom w:w="0" w:type="dxa"/>
-          </w:tblCellMar>
-        </w:tblPrEx>
         <w:tc>
           <w:tcPr>
             <w:tcW w:w="2800" w:type="dxa"/>
@@ -6820,12 +6366,6 @@
         </w:tc>
       </w:tr>
       <w:tr>
-        <w:tblPrEx>
-          <w:tblCellMar>
-            <w:top w:w="0" w:type="dxa"/>
-            <w:bottom w:w="0" w:type="dxa"/>
-          </w:tblCellMar>
-        </w:tblPrEx>
         <w:tc>
           <w:tcPr>
             <w:tcW w:w="2800" w:type="dxa"/>
@@ -6874,12 +6414,6 @@
         </w:tc>
       </w:tr>
       <w:tr>
-        <w:tblPrEx>
-          <w:tblCellMar>
-            <w:top w:w="0" w:type="dxa"/>
-            <w:bottom w:w="0" w:type="dxa"/>
-          </w:tblCellMar>
-        </w:tblPrEx>
         <w:tc>
           <w:tcPr>
             <w:tcW w:w="2800" w:type="dxa"/>
@@ -6985,12 +6519,6 @@
         <w:gridCol w:w="2949"/>
       </w:tblGrid>
       <w:tr>
-        <w:tblPrEx>
-          <w:tblCellMar>
-            <w:top w:w="0" w:type="dxa"/>
-            <w:bottom w:w="0" w:type="dxa"/>
-          </w:tblCellMar>
-        </w:tblPrEx>
         <w:trPr>
           <w:tblHeader/>
         </w:trPr>
@@ -7089,12 +6617,6 @@
         </w:tc>
       </w:tr>
       <w:tr>
-        <w:tblPrEx>
-          <w:tblCellMar>
-            <w:top w:w="0" w:type="dxa"/>
-            <w:bottom w:w="0" w:type="dxa"/>
-          </w:tblCellMar>
-        </w:tblPrEx>
         <w:tc>
           <w:tcPr>
             <w:tcW w:w="2800" w:type="dxa"/>
@@ -7166,12 +6688,6 @@
         </w:tc>
       </w:tr>
       <w:tr>
-        <w:tblPrEx>
-          <w:tblCellMar>
-            <w:top w:w="0" w:type="dxa"/>
-            <w:bottom w:w="0" w:type="dxa"/>
-          </w:tblCellMar>
-        </w:tblPrEx>
         <w:tc>
           <w:tcPr>
             <w:tcW w:w="2800" w:type="dxa"/>
@@ -7243,12 +6759,6 @@
         </w:tc>
       </w:tr>
       <w:tr>
-        <w:tblPrEx>
-          <w:tblCellMar>
-            <w:top w:w="0" w:type="dxa"/>
-            <w:bottom w:w="0" w:type="dxa"/>
-          </w:tblCellMar>
-        </w:tblPrEx>
         <w:tc>
           <w:tcPr>
             <w:tcW w:w="2800" w:type="dxa"/>
@@ -7320,12 +6830,6 @@
         </w:tc>
       </w:tr>
       <w:tr>
-        <w:tblPrEx>
-          <w:tblCellMar>
-            <w:top w:w="0" w:type="dxa"/>
-            <w:bottom w:w="0" w:type="dxa"/>
-          </w:tblCellMar>
-        </w:tblPrEx>
         <w:tc>
           <w:tcPr>
             <w:tcW w:w="2800" w:type="dxa"/>
@@ -7485,12 +6989,6 @@
         <w:gridCol w:w="4226"/>
       </w:tblGrid>
       <w:tr>
-        <w:tblPrEx>
-          <w:tblCellMar>
-            <w:top w:w="0" w:type="dxa"/>
-            <w:bottom w:w="0" w:type="dxa"/>
-          </w:tblCellMar>
-        </w:tblPrEx>
         <w:trPr>
           <w:tblHeader/>
         </w:trPr>
@@ -7589,12 +7087,6 @@
         </w:tc>
       </w:tr>
       <w:tr>
-        <w:tblPrEx>
-          <w:tblCellMar>
-            <w:top w:w="0" w:type="dxa"/>
-            <w:bottom w:w="0" w:type="dxa"/>
-          </w:tblCellMar>
-        </w:tblPrEx>
         <w:tc>
           <w:tcPr>
             <w:tcW w:w="2000" w:type="dxa"/>
@@ -7666,12 +7158,6 @@
         </w:tc>
       </w:tr>
       <w:tr>
-        <w:tblPrEx>
-          <w:tblCellMar>
-            <w:top w:w="0" w:type="dxa"/>
-            <w:bottom w:w="0" w:type="dxa"/>
-          </w:tblCellMar>
-        </w:tblPrEx>
         <w:tc>
           <w:tcPr>
             <w:tcW w:w="2000" w:type="dxa"/>
@@ -7900,6 +7386,21 @@
       <w:r>
         <w:t>Status do envio de e-mail</w:t>
       </w:r>
+    </w:p>
+    <w:p>
+      <w:pPr>
+        <w:pStyle w:val="PargrafodaLista"/>
+        <w:numPr>
+          <w:ilvl w:val="0"/>
+          <w:numId w:val="3"/>
+        </w:numPr>
+        <w:spacing w:before="40" w:after="40"/>
+      </w:pPr>
+      <w:proofErr w:type="spellStart"/>
+      <w:r>
+        <w:t>usuario</w:t>
+      </w:r>
+      <w:proofErr w:type="spellEnd"/>
     </w:p>
     <w:p>
       <w:pPr>
@@ -8019,12 +7520,6 @@
         <w:gridCol w:w="9026"/>
       </w:tblGrid>
       <w:tr>
-        <w:tblPrEx>
-          <w:tblCellMar>
-            <w:top w:w="0" w:type="dxa"/>
-            <w:bottom w:w="0" w:type="dxa"/>
-          </w:tblCellMar>
-        </w:tblPrEx>
         <w:tc>
           <w:tcPr>
             <w:tcW w:w="9026" w:type="dxa"/>
@@ -8140,12 +7635,6 @@
         <w:gridCol w:w="3226"/>
       </w:tblGrid>
       <w:tr>
-        <w:tblPrEx>
-          <w:tblCellMar>
-            <w:top w:w="0" w:type="dxa"/>
-            <w:bottom w:w="0" w:type="dxa"/>
-          </w:tblCellMar>
-        </w:tblPrEx>
         <w:trPr>
           <w:tblHeader/>
         </w:trPr>
@@ -8244,12 +7733,6 @@
         </w:tc>
       </w:tr>
       <w:tr>
-        <w:tblPrEx>
-          <w:tblCellMar>
-            <w:top w:w="0" w:type="dxa"/>
-            <w:bottom w:w="0" w:type="dxa"/>
-          </w:tblCellMar>
-        </w:tblPrEx>
         <w:tc>
           <w:tcPr>
             <w:tcW w:w="2400" w:type="dxa"/>
@@ -8321,12 +7804,6 @@
         </w:tc>
       </w:tr>
       <w:tr>
-        <w:tblPrEx>
-          <w:tblCellMar>
-            <w:top w:w="0" w:type="dxa"/>
-            <w:bottom w:w="0" w:type="dxa"/>
-          </w:tblCellMar>
-        </w:tblPrEx>
         <w:tc>
           <w:tcPr>
             <w:tcW w:w="2400" w:type="dxa"/>
@@ -8413,12 +7890,6 @@
         </w:tc>
       </w:tr>
       <w:tr>
-        <w:tblPrEx>
-          <w:tblCellMar>
-            <w:top w:w="0" w:type="dxa"/>
-            <w:bottom w:w="0" w:type="dxa"/>
-          </w:tblCellMar>
-        </w:tblPrEx>
         <w:tc>
           <w:tcPr>
             <w:tcW w:w="2400" w:type="dxa"/>
@@ -8490,12 +7961,6 @@
         </w:tc>
       </w:tr>
       <w:tr>
-        <w:tblPrEx>
-          <w:tblCellMar>
-            <w:top w:w="0" w:type="dxa"/>
-            <w:bottom w:w="0" w:type="dxa"/>
-          </w:tblCellMar>
-        </w:tblPrEx>
         <w:tc>
           <w:tcPr>
             <w:tcW w:w="2400" w:type="dxa"/>
@@ -8567,12 +8032,6 @@
         </w:tc>
       </w:tr>
       <w:tr>
-        <w:tblPrEx>
-          <w:tblCellMar>
-            <w:top w:w="0" w:type="dxa"/>
-            <w:bottom w:w="0" w:type="dxa"/>
-          </w:tblCellMar>
-        </w:tblPrEx>
         <w:tc>
           <w:tcPr>
             <w:tcW w:w="2400" w:type="dxa"/>
@@ -8955,12 +8414,6 @@
         <w:gridCol w:w="9026"/>
       </w:tblGrid>
       <w:tr>
-        <w:tblPrEx>
-          <w:tblCellMar>
-            <w:top w:w="0" w:type="dxa"/>
-            <w:bottom w:w="0" w:type="dxa"/>
-          </w:tblCellMar>
-        </w:tblPrEx>
         <w:tc>
           <w:tcPr>
             <w:tcW w:w="9026" w:type="dxa"/>
@@ -9316,12 +8769,6 @@
         <w:gridCol w:w="9026"/>
       </w:tblGrid>
       <w:tr>
-        <w:tblPrEx>
-          <w:tblCellMar>
-            <w:top w:w="0" w:type="dxa"/>
-            <w:bottom w:w="0" w:type="dxa"/>
-          </w:tblCellMar>
-        </w:tblPrEx>
         <w:tc>
           <w:tcPr>
             <w:tcW w:w="9026" w:type="dxa"/>
@@ -9354,12 +8801,6 @@
         </w:tc>
       </w:tr>
       <w:tr>
-        <w:tblPrEx>
-          <w:tblCellMar>
-            <w:top w:w="0" w:type="dxa"/>
-            <w:bottom w:w="0" w:type="dxa"/>
-          </w:tblCellMar>
-        </w:tblPrEx>
         <w:tc>
           <w:tcPr>
             <w:tcW w:w="9026" w:type="dxa"/>
@@ -9835,12 +9276,6 @@
         <w:gridCol w:w="4000"/>
       </w:tblGrid>
       <w:tr>
-        <w:tblPrEx>
-          <w:tblCellMar>
-            <w:top w:w="0" w:type="dxa"/>
-            <w:bottom w:w="0" w:type="dxa"/>
-          </w:tblCellMar>
-        </w:tblPrEx>
         <w:trPr>
           <w:tblHeader/>
         </w:trPr>
@@ -9939,12 +9374,6 @@
         </w:tc>
       </w:tr>
       <w:tr>
-        <w:tblPrEx>
-          <w:tblCellMar>
-            <w:top w:w="0" w:type="dxa"/>
-            <w:bottom w:w="0" w:type="dxa"/>
-          </w:tblCellMar>
-        </w:tblPrEx>
         <w:tc>
           <w:tcPr>
             <w:tcW w:w="2000" w:type="dxa"/>
@@ -10024,12 +9453,6 @@
         </w:tc>
       </w:tr>
       <w:tr>
-        <w:tblPrEx>
-          <w:tblCellMar>
-            <w:top w:w="0" w:type="dxa"/>
-            <w:bottom w:w="0" w:type="dxa"/>
-          </w:tblCellMar>
-        </w:tblPrEx>
         <w:tc>
           <w:tcPr>
             <w:tcW w:w="2000" w:type="dxa"/>
@@ -10113,12 +9536,6 @@
         </w:tc>
       </w:tr>
       <w:tr>
-        <w:tblPrEx>
-          <w:tblCellMar>
-            <w:top w:w="0" w:type="dxa"/>
-            <w:bottom w:w="0" w:type="dxa"/>
-          </w:tblCellMar>
-        </w:tblPrEx>
         <w:tc>
           <w:tcPr>
             <w:tcW w:w="2000" w:type="dxa"/>

</xml_diff>